<commit_message>
quito top-k features de dipeptidos, agrego TMDS, NLS, etc.
</commit_message>
<xml_diff>
--- a/docs/guia_alumnos.docx
+++ b/docs/guia_alumnos.docx
@@ -91,8 +91,7 @@
         <w:rPr/>
       </w:pPr>
       <w:r>
-        <w:rPr/>
-        <w:t>~250 proteínas en total, balanceadas entre clases.</w:t>
+        <w:t>750 proteínas en total (250 por clase), con evidencia experimental a nivel de proteína, balanceadas entre clases.</w:t>
       </w:r>
     </w:p>
     <w:p>
@@ -111,12 +110,24 @@
     </w:p>
     <w:p>
       <w:pPr>
+        <w:pStyle w:val="ListParagraph"/>
+        <w:numPr>
+          <w:ilvl w:val="0"/>
+          <w:numId w:val="1"/>
+        </w:numPr>
+        <w:rPr/>
+      </w:pPr>
+      <w:r>
+        <w:t>Solo entradas revisadas con evidencia experimental (UniProt existence:1); se descartan secuencias con residuos no estándar.</w:t>
+      </w:r>
+    </w:p>
+    <w:p>
+      <w:pPr>
         <w:pStyle w:val="Heading1"/>
         <w:rPr/>
       </w:pPr>
       <w:r>
-        <w:rPr/>
-        <w:t>Referencia: los 10 features fisicoquímicos</w:t>
+        <w:t>Referencia: los features fisicoquímicos (13)</w:t>
       </w:r>
     </w:p>
     <w:p>
@@ -125,8 +136,7 @@
         <w:rPr/>
       </w:pPr>
       <w:r>
-        <w:rPr/>
-        <w:t>Ambos CSV incluyen, además de la composición/dipéptidos, estas 10 columnas calculadas a partir de la secuencia completa con Biopython (ProteinAnalysis):</w:t>
+        <w:t>Los tres CSV incluyen, además de la composición/dipéptidos/señales, estas 13 columnas calculadas a partir de la secuencia completa con Biopython (ProteinAnalysis):</w:t>
       </w:r>
     </w:p>
     <w:tbl>
@@ -708,6 +718,72 @@
           </w:p>
         </w:tc>
       </w:tr>
+      <w:tr>
+        <w:tc>
+          <w:tcPr>
+            <w:tcW w:type="dxa" w:w="2600"/>
+          </w:tcPr>
+          <w:p>
+            <w:r>
+              <w:t>indice_alifatico</w:t>
+            </w:r>
+          </w:p>
+        </w:tc>
+        <w:tc>
+          <w:tcPr>
+            <w:tcW w:type="dxa" w:w="6749"/>
+          </w:tcPr>
+          <w:p>
+            <w:r>
+              <w:t>Índice alifático (Ikai, 1980): termoestabilidad relativa; alto = rico en A, V, I y L.</w:t>
+            </w:r>
+          </w:p>
+        </w:tc>
+      </w:tr>
+      <w:tr>
+        <w:tc>
+          <w:tcPr>
+            <w:tcW w:type="dxa" w:w="2600"/>
+          </w:tcPr>
+          <w:p>
+            <w:r>
+              <w:t>fraccion_cargados</w:t>
+            </w:r>
+          </w:p>
+        </w:tc>
+        <w:tc>
+          <w:tcPr>
+            <w:tcW w:type="dxa" w:w="6749"/>
+          </w:tcPr>
+          <w:p>
+            <w:r>
+              <w:t>Fracción de aminoácidos con carga (K, R, H, D, E).</w:t>
+            </w:r>
+          </w:p>
+        </w:tc>
+      </w:tr>
+      <w:tr>
+        <w:tc>
+          <w:tcPr>
+            <w:tcW w:type="dxa" w:w="2600"/>
+          </w:tcPr>
+          <w:p>
+            <w:r>
+              <w:t>coef_extincion_molar</w:t>
+            </w:r>
+          </w:p>
+        </w:tc>
+        <w:tc>
+          <w:tcPr>
+            <w:tcW w:type="dxa" w:w="6749"/>
+          </w:tcPr>
+          <w:p>
+            <w:r>
+              <w:t>Coeficiente de extinción molar a 280 nm (aporte de C, Y, W).</w:t>
+            </w:r>
+          </w:p>
+        </w:tc>
+      </w:tr>
     </w:tbl>
     <w:p>
       <w:pPr>
@@ -726,6 +802,307 @@
       <w:r>
         <w:rPr/>
         <w:t>Estos son justamente los features que en una versión anterior del práctico se le pedían a un asistente de IA que calculara en vivo — ahora vienen ya resueltos en el CSV, así que no hace falta recalcularlos.</w:t>
+      </w:r>
+    </w:p>
+    <w:p>
+      <w:pPr>
+        <w:pStyle w:val="Heading1"/>
+        <w:rPr/>
+      </w:pPr>
+      <w:r>
+        <w:t>Referencia: las señales posicionales (11)</w:t>
+      </w:r>
+    </w:p>
+    <w:p>
+      <w:pPr>
+        <w:pStyle w:val="Normal"/>
+        <w:rPr/>
+      </w:pPr>
+      <w:r>
+        <w:t>El tercer CSV agrega 11 columnas calculadas con heurísticas simples y transparentes. NO son predictores entrenados: sirven para discutir qué información aporta la posición de un motivo biológico.</w:t>
+      </w:r>
+    </w:p>
+    <w:tbl>
+      <w:tblPr>
+        <w:tblW w:type="auto" w:w="0"/>
+        <w:tblLook w:firstColumn="1" w:firstRow="1" w:lastColumn="0" w:lastRow="0" w:noHBand="0" w:noVBand="1" w:val="04A0"/>
+      </w:tblPr>
+      <w:tblGrid>
+        <w:gridCol w:w="4680"/>
+        <w:gridCol w:w="4680"/>
+      </w:tblGrid>
+      <w:tr>
+        <w:tc>
+          <w:tcPr>
+            <w:tcW w:type="dxa" w:w="4680"/>
+          </w:tcPr>
+          <w:p>
+            <w:r>
+              <w:t>Columna</w:t>
+            </w:r>
+          </w:p>
+        </w:tc>
+        <w:tc>
+          <w:tcPr>
+            <w:tcW w:type="dxa" w:w="4680"/>
+          </w:tcPr>
+          <w:p>
+            <w:r>
+              <w:t>Qué mide</w:t>
+            </w:r>
+          </w:p>
+        </w:tc>
+      </w:tr>
+      <w:tr>
+        <w:tc>
+          <w:tcPr>
+            <w:tcW w:type="dxa" w:w="4680"/>
+          </w:tcPr>
+          <w:p>
+            <w:r>
+              <w:t>senal_peptido</w:t>
+            </w:r>
+          </w:p>
+        </w:tc>
+        <w:tc>
+          <w:tcPr>
+            <w:tcW w:type="dxa" w:w="4680"/>
+          </w:tcPr>
+          <w:p>
+            <w:r>
+              <w:t>1 si se detecta péptido señal N-terminal (región básica + tramo hidrofóbico); 0 si no.</w:t>
+            </w:r>
+          </w:p>
+        </w:tc>
+      </w:tr>
+      <w:tr>
+        <w:tc>
+          <w:tcPr>
+            <w:tcW w:type="dxa" w:w="4680"/>
+          </w:tcPr>
+          <w:p>
+            <w:r>
+              <w:t>senal_hidrofobicidad_max</w:t>
+            </w:r>
+          </w:p>
+        </w:tc>
+        <w:tc>
+          <w:tcPr>
+            <w:tcW w:type="dxa" w:w="4680"/>
+          </w:tcPr>
+          <w:p>
+            <w:r>
+              <w:t>Hidrofobicidad media máxima (Kyte-Doolittle) en ventanas de 9 residuos del N-terminal.</w:t>
+            </w:r>
+          </w:p>
+        </w:tc>
+      </w:tr>
+      <w:tr>
+        <w:tc>
+          <w:tcPr>
+            <w:tcW w:type="dxa" w:w="4680"/>
+          </w:tcPr>
+          <w:p>
+            <w:r>
+              <w:t>senal_n_basicos</w:t>
+            </w:r>
+          </w:p>
+        </w:tc>
+        <w:tc>
+          <w:tcPr>
+            <w:tcW w:type="dxa" w:w="4680"/>
+          </w:tcPr>
+          <w:p>
+            <w:r>
+              <w:t>Cantidad de K/R en los primeros 5 residuos (región n).</w:t>
+            </w:r>
+          </w:p>
+        </w:tc>
+      </w:tr>
+      <w:tr>
+        <w:tc>
+          <w:tcPr>
+            <w:tcW w:type="dxa" w:w="4680"/>
+          </w:tcPr>
+          <w:p>
+            <w:r>
+              <w:t>nls_monopartita</w:t>
+            </w:r>
+          </w:p>
+        </w:tc>
+        <w:tc>
+          <w:tcPr>
+            <w:tcW w:type="dxa" w:w="4680"/>
+          </w:tcPr>
+          <w:p>
+            <w:r>
+              <w:t>Nº de motivos K(K/R)X(K/R) (NLS clásico monopartita).</w:t>
+            </w:r>
+          </w:p>
+        </w:tc>
+      </w:tr>
+      <w:tr>
+        <w:tc>
+          <w:tcPr>
+            <w:tcW w:type="dxa" w:w="4680"/>
+          </w:tcPr>
+          <w:p>
+            <w:r>
+              <w:t>nls_bipartita</w:t>
+            </w:r>
+          </w:p>
+        </w:tc>
+        <w:tc>
+          <w:tcPr>
+            <w:tcW w:type="dxa" w:w="4680"/>
+          </w:tcPr>
+          <w:p>
+            <w:r>
+              <w:t>Nº de NLS bipartitos (dos clusters básicos separados por ~10 residuos).</w:t>
+            </w:r>
+          </w:p>
+        </w:tc>
+      </w:tr>
+      <w:tr>
+        <w:tc>
+          <w:tcPr>
+            <w:tcW w:type="dxa" w:w="4680"/>
+          </w:tcPr>
+          <w:p>
+            <w:r>
+              <w:t>nls_densidad_basica_10</w:t>
+            </w:r>
+          </w:p>
+        </w:tc>
+        <w:tc>
+          <w:tcPr>
+            <w:tcW w:type="dxa" w:w="4680"/>
+          </w:tcPr>
+          <w:p>
+            <w:r>
+              <w:t>Máxima fracción de K/R en una ventana de 10 residuos.</w:t>
+            </w:r>
+          </w:p>
+        </w:tc>
+      </w:tr>
+      <w:tr>
+        <w:tc>
+          <w:tcPr>
+            <w:tcW w:type="dxa" w:w="4680"/>
+          </w:tcPr>
+          <w:p>
+            <w:r>
+              <w:t>nls_densidad_basica_7</w:t>
+            </w:r>
+          </w:p>
+        </w:tc>
+        <w:tc>
+          <w:tcPr>
+            <w:tcW w:type="dxa" w:w="4680"/>
+          </w:tcPr>
+          <w:p>
+            <w:r>
+              <w:t>Máxima fracción de K/R en una ventana de 7 residuos.</w:t>
+            </w:r>
+          </w:p>
+        </w:tc>
+      </w:tr>
+      <w:tr>
+        <w:tc>
+          <w:tcPr>
+            <w:tcW w:type="dxa" w:w="4680"/>
+          </w:tcPr>
+          <w:p>
+            <w:r>
+              <w:t>nls_carga_neta_nterm20</w:t>
+            </w:r>
+          </w:p>
+        </w:tc>
+        <w:tc>
+          <w:tcPr>
+            <w:tcW w:type="dxa" w:w="4680"/>
+          </w:tcPr>
+          <w:p>
+            <w:r>
+              <w:t>Carga neta (K+R − D−E) en los primeros 20 residuos.</w:t>
+            </w:r>
+          </w:p>
+        </w:tc>
+      </w:tr>
+      <w:tr>
+        <w:tc>
+          <w:tcPr>
+            <w:tcW w:type="dxa" w:w="4680"/>
+          </w:tcPr>
+          <w:p>
+            <w:r>
+              <w:t>tmd_alfa_helices</w:t>
+            </w:r>
+          </w:p>
+        </w:tc>
+        <w:tc>
+          <w:tcPr>
+            <w:tcW w:type="dxa" w:w="4680"/>
+          </w:tcPr>
+          <w:p>
+            <w:r>
+              <w:t>Nº de TMD alfa-hélice aproximados (ventanas de 19 residuos con hidrofobicidad media &gt; 1.6).</w:t>
+            </w:r>
+          </w:p>
+        </w:tc>
+      </w:tr>
+      <w:tr>
+        <w:tc>
+          <w:tcPr>
+            <w:tcW w:type="dxa" w:w="4680"/>
+          </w:tcPr>
+          <w:p>
+            <w:r>
+              <w:t>tmd_alfa_hidrofobicidad_max</w:t>
+            </w:r>
+          </w:p>
+        </w:tc>
+        <w:tc>
+          <w:tcPr>
+            <w:tcW w:type="dxa" w:w="4680"/>
+          </w:tcPr>
+          <w:p>
+            <w:r>
+              <w:t>Hidrofobicidad media máxima en una ventana de 19 residuos.</w:t>
+            </w:r>
+          </w:p>
+        </w:tc>
+      </w:tr>
+      <w:tr>
+        <w:tc>
+          <w:tcPr>
+            <w:tcW w:type="dxa" w:w="4680"/>
+          </w:tcPr>
+          <w:p>
+            <w:r>
+              <w:t>tmd_beta_momento_hidrofobico</w:t>
+            </w:r>
+          </w:p>
+        </w:tc>
+        <w:tc>
+          <w:tcPr>
+            <w:tcW w:type="dxa" w:w="4680"/>
+          </w:tcPr>
+          <w:p>
+            <w:r>
+              <w:t>Momento hidrofóbico de Eisenberg con periodicidad beta (160°); exploratorio.</w:t>
+            </w:r>
+          </w:p>
+        </w:tc>
+      </w:tr>
+    </w:tbl>
+    <w:p>
+      <w:pPr>
+        <w:pStyle w:val="Normal"/>
+        <w:rPr/>
+      </w:pPr>
+      <w:r>
+        <w:t>Limitación importante: estas señales son heurísticas simples, no predictores entrenados. El detector de péptido señal se solapa con anclas de membrana, y el descriptor beta no alcanza porque los beta-barriles de membrana son raros en proteínas humanas. Para una predicción real hay que usar SignalP/DeepSig (péptido señal), DeepTMHMM/TMbed (TMD) y DeepLoc (localización).</w:t>
       </w:r>
     </w:p>
     <w:p>
@@ -748,8 +1125,7 @@
         <w:rPr/>
       </w:pPr>
       <w:r>
-        <w:rPr/>
-        <w:t>features_composicion_fisicoquimicos.csv — cada proteína representada por la composición de sus 20 aminoácidos ("bag of aminoácidos") + 10 features fisicoquímicos globales.</w:t>
+        <w:t>features_composicion_fisicoquimicos.csv — cada proteína representada por la composición de sus 20 aminoácidos (bag of aminoácidos) + 13 features fisicoquímicos globales.</w:t>
       </w:r>
     </w:p>
     <w:p>
@@ -762,8 +1138,7 @@
         <w:rPr/>
       </w:pPr>
       <w:r>
-        <w:rPr/>
-        <w:t>features_dipeptidos_fisicoquimicos.csv — cada proteína representada por la frecuencia de sus 400 dipéptidos posibles (pares de aminoácidos consecutivos) + los mismos 10 features fisicoquímicos.</w:t>
+        <w:t>features_dipeptidos_fisicoquimicos.csv — cada proteína representada por la frecuencia de sus 400 dipéptidos posibles + los mismos 13 features fisicoquímicos.</w:t>
       </w:r>
     </w:p>
     <w:p>
@@ -776,8 +1151,7 @@
         <w:rPr/>
       </w:pPr>
       <w:r>
-        <w:rPr/>
-        <w:t>exploracion_alumnos.ipynb — notebook para el Bloque 1.</w:t>
+        <w:t>features_composicion_senales_fisicoquimicos.csv — composición + 13 fisicoquímicos + 11 señales posicionales (péptido señal, NLS, TMD). Es la representación que suele rendir mejor.</w:t>
       </w:r>
     </w:p>
     <w:p>
@@ -791,7 +1165,20 @@
       </w:pPr>
       <w:r>
         <w:rPr/>
-        <w:t>bag_of_aminoacidos.ows y dipeptidos.ows — workflows de Orange ya armados para los Bloques 2 y 3.</w:t>
+        <w:t>exploracion_alumnos.ipynb — notebook para el Bloque 1.</w:t>
+      </w:r>
+    </w:p>
+    <w:p>
+      <w:pPr>
+        <w:pStyle w:val="ListParagraph"/>
+        <w:numPr>
+          <w:ilvl w:val="0"/>
+          <w:numId w:val="1"/>
+        </w:numPr>
+        <w:rPr/>
+      </w:pPr>
+      <w:r>
+        <w:t>bag_of_aminoacidos.ows, dipeptidos.ows y senales_posicionales.ows — workflows de Orange ya armados para los Bloques 2, 3 y 4.</w:t>
       </w:r>
     </w:p>
     <w:p>
@@ -800,8 +1187,7 @@
         <w:rPr/>
       </w:pPr>
       <w:r>
-        <w:rPr/>
-        <w:t>Ambos CSV incluyen columnas accession y sequence al principio — sirven para identificar cada proteína, pero no son features. Al cargarlos en Orange, márquenlas como meta en el editor de dominio del widget File (no las dejen como features numéricas).</w:t>
+        <w:t>Los tres CSV incluyen columnas accession y sequence al principio — sirven para identificar cada proteína, pero no son features. Al cargarlos en Orange, márquenlas como meta en el editor de dominio del widget File.</w:t>
       </w:r>
     </w:p>
     <w:p>
@@ -846,15 +1232,7 @@
             <w:shd w:fill="D9E2F3" w:val="clear"/>
           </w:tcPr>
           <w:p>
-            <w:pPr>
-              <w:pStyle w:val="Normal"/>
-              <w:rPr/>
-            </w:pPr>
-            <w:r>
-              <w:rPr>
-                <w:b/>
-                <w:bCs/>
-              </w:rPr>
+            <w:r>
               <w:t>Bloque</w:t>
             </w:r>
           </w:p>
@@ -871,15 +1249,7 @@
             <w:shd w:fill="D9E2F3" w:val="clear"/>
           </w:tcPr>
           <w:p>
-            <w:pPr>
-              <w:pStyle w:val="Normal"/>
-              <w:rPr/>
-            </w:pPr>
-            <w:r>
-              <w:rPr>
-                <w:b/>
-                <w:bCs/>
-              </w:rPr>
+            <w:r>
               <w:t>Duración</w:t>
             </w:r>
           </w:p>
@@ -896,15 +1266,7 @@
             <w:shd w:fill="D9E2F3" w:val="clear"/>
           </w:tcPr>
           <w:p>
-            <w:pPr>
-              <w:pStyle w:val="Normal"/>
-              <w:rPr/>
-            </w:pPr>
-            <w:r>
-              <w:rPr>
-                <w:b/>
-                <w:bCs/>
-              </w:rPr>
+            <w:r>
               <w:t>Herramienta</w:t>
             </w:r>
           </w:p>
@@ -921,15 +1283,7 @@
             <w:shd w:fill="D9E2F3" w:val="clear"/>
           </w:tcPr>
           <w:p>
-            <w:pPr>
-              <w:pStyle w:val="Normal"/>
-              <w:rPr/>
-            </w:pPr>
-            <w:r>
-              <w:rPr>
-                <w:b/>
-                <w:bCs/>
-              </w:rPr>
+            <w:r>
               <w:t>Contenido</w:t>
             </w:r>
           </w:p>
@@ -948,15 +1302,7 @@
             </w:tcBorders>
           </w:tcPr>
           <w:p>
-            <w:pPr>
-              <w:pStyle w:val="Normal"/>
-              <w:rPr/>
-            </w:pPr>
-            <w:r>
-              <w:rPr>
-                <w:b w:val="false"/>
-                <w:bCs w:val="false"/>
-              </w:rPr>
+            <w:r>
               <w:t>0. Introducción</w:t>
             </w:r>
           </w:p>
@@ -972,15 +1318,7 @@
             </w:tcBorders>
           </w:tcPr>
           <w:p>
-            <w:pPr>
-              <w:pStyle w:val="Normal"/>
-              <w:rPr/>
-            </w:pPr>
-            <w:r>
-              <w:rPr>
-                <w:b w:val="false"/>
-                <w:bCs w:val="false"/>
-              </w:rPr>
+            <w:r>
               <w:t>10 min</w:t>
             </w:r>
           </w:p>
@@ -996,15 +1334,7 @@
             </w:tcBorders>
           </w:tcPr>
           <w:p>
-            <w:pPr>
-              <w:pStyle w:val="Normal"/>
-              <w:rPr/>
-            </w:pPr>
-            <w:r>
-              <w:rPr>
-                <w:b w:val="false"/>
-                <w:bCs w:val="false"/>
-              </w:rPr>
+            <w:r>
               <w:t>-</w:t>
             </w:r>
           </w:p>
@@ -1020,15 +1350,7 @@
             </w:tcBorders>
           </w:tcPr>
           <w:p>
-            <w:pPr>
-              <w:pStyle w:val="Normal"/>
-              <w:rPr/>
-            </w:pPr>
-            <w:r>
-              <w:rPr>
-                <w:b w:val="false"/>
-                <w:bCs w:val="false"/>
-              </w:rPr>
+            <w:r>
               <w:t>Contexto del problema, dataset, y organización de la clase.</w:t>
             </w:r>
           </w:p>
@@ -1047,15 +1369,7 @@
             </w:tcBorders>
           </w:tcPr>
           <w:p>
-            <w:pPr>
-              <w:pStyle w:val="Normal"/>
-              <w:rPr/>
-            </w:pPr>
-            <w:r>
-              <w:rPr>
-                <w:b w:val="false"/>
-                <w:bCs w:val="false"/>
-              </w:rPr>
+            <w:r>
               <w:t>1. Exploración de datos con IA</w:t>
             </w:r>
           </w:p>
@@ -1071,16 +1385,8 @@
             </w:tcBorders>
           </w:tcPr>
           <w:p>
-            <w:pPr>
-              <w:pStyle w:val="Normal"/>
-              <w:rPr/>
-            </w:pPr>
-            <w:r>
-              <w:rPr>
-                <w:b w:val="false"/>
-                <w:bCs w:val="false"/>
-              </w:rPr>
-              <w:t>70 min</w:t>
+            <w:r>
+              <w:t>50 min</w:t>
             </w:r>
           </w:p>
         </w:tc>
@@ -1095,15 +1401,7 @@
             </w:tcBorders>
           </w:tcPr>
           <w:p>
-            <w:pPr>
-              <w:pStyle w:val="Normal"/>
-              <w:rPr/>
-            </w:pPr>
-            <w:r>
-              <w:rPr>
-                <w:b w:val="false"/>
-                <w:bCs w:val="false"/>
-              </w:rPr>
+            <w:r>
               <w:t>Python (notebook)</w:t>
             </w:r>
           </w:p>
@@ -1119,16 +1417,8 @@
             </w:tcBorders>
           </w:tcPr>
           <w:p>
-            <w:pPr>
-              <w:pStyle w:val="Normal"/>
-              <w:rPr/>
-            </w:pPr>
-            <w:r>
-              <w:rPr>
-                <w:b w:val="false"/>
-                <w:bCs w:val="false"/>
-              </w:rPr>
-              <w:t>Generar y analizar 5 gráficos exploratorios de los datos, con ayuda de un asistente de IA.</w:t>
+            <w:r>
+              <w:t>Generar y analizar 6 gráficos exploratorios, con ayuda de un asistente de IA.</w:t>
             </w:r>
           </w:p>
         </w:tc>
@@ -1146,15 +1436,7 @@
             </w:tcBorders>
           </w:tcPr>
           <w:p>
-            <w:pPr>
-              <w:pStyle w:val="Normal"/>
-              <w:rPr/>
-            </w:pPr>
-            <w:r>
-              <w:rPr>
-                <w:b w:val="false"/>
-                <w:bCs w:val="false"/>
-              </w:rPr>
+            <w:r>
               <w:t>2. Clasificación: bag de aminoácidos</w:t>
             </w:r>
           </w:p>
@@ -1170,16 +1452,8 @@
             </w:tcBorders>
           </w:tcPr>
           <w:p>
-            <w:pPr>
-              <w:pStyle w:val="Normal"/>
-              <w:rPr/>
-            </w:pPr>
-            <w:r>
-              <w:rPr>
-                <w:b w:val="false"/>
-                <w:bCs w:val="false"/>
-              </w:rPr>
-              <w:t>50 min</w:t>
+            <w:r>
+              <w:t>40 min</w:t>
             </w:r>
           </w:p>
         </w:tc>
@@ -1194,15 +1468,7 @@
             </w:tcBorders>
           </w:tcPr>
           <w:p>
-            <w:pPr>
-              <w:pStyle w:val="Normal"/>
-              <w:rPr/>
-            </w:pPr>
-            <w:r>
-              <w:rPr>
-                <w:b w:val="false"/>
-                <w:bCs w:val="false"/>
-              </w:rPr>
+            <w:r>
               <w:t>Orange</w:t>
             </w:r>
           </w:p>
@@ -1218,15 +1484,7 @@
             </w:tcBorders>
           </w:tcPr>
           <w:p>
-            <w:pPr>
-              <w:pStyle w:val="Normal"/>
-              <w:rPr/>
-            </w:pPr>
-            <w:r>
-              <w:rPr>
-                <w:b w:val="false"/>
-                <w:bCs w:val="false"/>
-              </w:rPr>
+            <w:r>
               <w:t>Cargar features_composicion_fisicoquimicos.csv y comparar 3 modelos.</w:t>
             </w:r>
           </w:p>
@@ -1245,15 +1503,7 @@
             </w:tcBorders>
           </w:tcPr>
           <w:p>
-            <w:pPr>
-              <w:pStyle w:val="Normal"/>
-              <w:rPr/>
-            </w:pPr>
-            <w:r>
-              <w:rPr>
-                <w:b w:val="false"/>
-                <w:bCs w:val="false"/>
-              </w:rPr>
+            <w:r>
               <w:t>3. Clasificación: dipéptidos</w:t>
             </w:r>
           </w:p>
@@ -1269,16 +1519,8 @@
             </w:tcBorders>
           </w:tcPr>
           <w:p>
-            <w:pPr>
-              <w:pStyle w:val="Normal"/>
-              <w:rPr/>
-            </w:pPr>
-            <w:r>
-              <w:rPr>
-                <w:b w:val="false"/>
-                <w:bCs w:val="false"/>
-              </w:rPr>
-              <w:t>50 min</w:t>
+            <w:r>
+              <w:t>40 min</w:t>
             </w:r>
           </w:p>
         </w:tc>
@@ -1293,15 +1535,7 @@
             </w:tcBorders>
           </w:tcPr>
           <w:p>
-            <w:pPr>
-              <w:pStyle w:val="Normal"/>
-              <w:rPr/>
-            </w:pPr>
-            <w:r>
-              <w:rPr>
-                <w:b w:val="false"/>
-                <w:bCs w:val="false"/>
-              </w:rPr>
+            <w:r>
               <w:t>Orange</w:t>
             </w:r>
           </w:p>
@@ -1317,21 +1551,55 @@
             </w:tcBorders>
           </w:tcPr>
           <w:p>
-            <w:pPr>
-              <w:pStyle w:val="Normal"/>
-              <w:rPr/>
-            </w:pPr>
-            <w:r>
-              <w:rPr>
-                <w:b w:val="false"/>
-                <w:bCs w:val="false"/>
-              </w:rPr>
+            <w:r>
               <w:t>Cargar features_dipeptidos_fisicoquimicos.csv y comparar contra el Bloque 2.</w:t>
             </w:r>
           </w:p>
         </w:tc>
       </w:tr>
       <w:tr>
+        <w:tc>
+          <w:tcPr>
+            <w:tcW w:type="dxa" w:w="2200"/>
+          </w:tcPr>
+          <w:p>
+            <w:r>
+              <w:t>4. Clasificación: señales posicionales</w:t>
+            </w:r>
+          </w:p>
+        </w:tc>
+        <w:tc>
+          <w:tcPr>
+            <w:tcW w:type="dxa" w:w="1000"/>
+          </w:tcPr>
+          <w:p>
+            <w:r>
+              <w:t>40 min</w:t>
+            </w:r>
+          </w:p>
+        </w:tc>
+        <w:tc>
+          <w:tcPr>
+            <w:tcW w:type="dxa" w:w="1600"/>
+          </w:tcPr>
+          <w:p>
+            <w:r>
+              <w:t>Orange</w:t>
+            </w:r>
+          </w:p>
+        </w:tc>
+        <w:tc>
+          <w:tcPr>
+            <w:tcW w:type="dxa" w:w="4549"/>
+          </w:tcPr>
+          <w:p>
+            <w:r>
+              <w:t>Cargar features_composicion_senales_fisicoquimicos.csv y usar Rank.</w:t>
+            </w:r>
+          </w:p>
+        </w:tc>
+      </w:tr>
+      <w:tr>
         <w:trPr/>
         <w:tc>
           <w:tcPr>
@@ -1344,16 +1612,8 @@
             </w:tcBorders>
           </w:tcPr>
           <w:p>
-            <w:pPr>
-              <w:pStyle w:val="Normal"/>
-              <w:rPr/>
-            </w:pPr>
-            <w:r>
-              <w:rPr>
-                <w:b w:val="false"/>
-                <w:bCs w:val="false"/>
-              </w:rPr>
-              <w:t>4. Comparación final y discusión</w:t>
+            <w:r>
+              <w:t>5. Overfitting y curse of dimensionality</w:t>
             </w:r>
           </w:p>
         </w:tc>
@@ -1368,16 +1628,8 @@
             </w:tcBorders>
           </w:tcPr>
           <w:p>
-            <w:pPr>
-              <w:pStyle w:val="Normal"/>
-              <w:rPr/>
-            </w:pPr>
-            <w:r>
-              <w:rPr>
-                <w:b w:val="false"/>
-                <w:bCs w:val="false"/>
-              </w:rPr>
-              <w:t>60 min</w:t>
+            <w:r>
+              <w:t>30 min</w:t>
             </w:r>
           </w:p>
         </w:tc>
@@ -1392,40 +1644,66 @@
             </w:tcBorders>
           </w:tcPr>
           <w:p>
-            <w:pPr>
-              <w:pStyle w:val="Normal"/>
-              <w:rPr/>
-            </w:pPr>
-            <w:r>
-              <w:rPr>
-                <w:b w:val="false"/>
-                <w:bCs w:val="false"/>
-              </w:rPr>
+            <w:r>
+              <w:t>Script/informe</w:t>
+            </w:r>
+          </w:p>
+        </w:tc>
+        <w:tc>
+          <w:tcPr>
+            <w:tcW w:w="4549" w:type="dxa"/>
+            <w:tcBorders>
+              <w:top w:val="single" w:sz="4" w:space="0" w:color="000000"/>
+              <w:left w:val="single" w:sz="4" w:space="0" w:color="000000"/>
+              <w:bottom w:val="single" w:sz="4" w:space="0" w:color="000000"/>
+              <w:right w:val="single" w:sz="4" w:space="0" w:color="000000"/>
+            </w:tcBorders>
+          </w:tcPr>
+          <w:p>
+            <w:r>
+              <w:t>Ver F1 en train vs test y por qué más features no siempre ayudan.</w:t>
+            </w:r>
+          </w:p>
+        </w:tc>
+      </w:tr>
+      <w:tr>
+        <w:tc>
+          <w:tcPr>
+            <w:tcW w:type="dxa" w:w="2200"/>
+          </w:tcPr>
+          <w:p>
+            <w:r>
+              <w:t>6. Comparación final y discusión</w:t>
+            </w:r>
+          </w:p>
+        </w:tc>
+        <w:tc>
+          <w:tcPr>
+            <w:tcW w:type="dxa" w:w="1000"/>
+          </w:tcPr>
+          <w:p>
+            <w:r>
+              <w:t>30 min</w:t>
+            </w:r>
+          </w:p>
+        </w:tc>
+        <w:tc>
+          <w:tcPr>
+            <w:tcW w:type="dxa" w:w="1600"/>
+          </w:tcPr>
+          <w:p>
+            <w:r>
               <w:t>Informe</w:t>
             </w:r>
           </w:p>
         </w:tc>
         <w:tc>
           <w:tcPr>
-            <w:tcW w:w="4549" w:type="dxa"/>
-            <w:tcBorders>
-              <w:top w:val="single" w:sz="4" w:space="0" w:color="000000"/>
-              <w:left w:val="single" w:sz="4" w:space="0" w:color="000000"/>
-              <w:bottom w:val="single" w:sz="4" w:space="0" w:color="000000"/>
-              <w:right w:val="single" w:sz="4" w:space="0" w:color="000000"/>
-            </w:tcBorders>
-          </w:tcPr>
-          <w:p>
-            <w:pPr>
-              <w:pStyle w:val="Normal"/>
-              <w:rPr/>
-            </w:pPr>
-            <w:r>
-              <w:rPr>
-                <w:b w:val="false"/>
-                <w:bCs w:val="false"/>
-              </w:rPr>
-              <w:t>Tabla comparativa, análisis de errores, preguntas de discusión.</w:t>
+            <w:tcW w:type="dxa" w:w="4549"/>
+          </w:tcPr>
+          <w:p>
+            <w:r>
+              <w:t>Tabla comparativa, análisis de errores y preguntas de discusión.</w:t>
             </w:r>
           </w:p>
         </w:tc>
@@ -1447,8 +1725,7 @@
         <w:rPr/>
       </w:pPr>
       <w:r>
-        <w:rPr/>
-        <w:t>Abran exploracion_alumnos.ipynb. Para cada uno de los 5 gráficos propuestos (balance de clases, longitud por clase, composición aminoacídica por clase, features fisicoquímicos por clase, dipéptidos más variables entre clases):</w:t>
+        <w:t>Abran exploracion_alumnos.ipynb. Para cada uno de los 6 gráficos propuestos (balance de clases, longitud por clase, composición aminoacídica por clase, features fisicoquímicos por clase, dipéptidos más variables entre clases, señales posicionales por clase):</w:t>
       </w:r>
     </w:p>
     <w:p>
@@ -1527,8 +1804,7 @@
         <w:rPr/>
       </w:pPr>
       <w:r>
-        <w:rPr/>
-        <w:t>Al final del notebook hay una síntesis para completar — guárdenla, la van a poder contrastar con los resultados reales del Bloque 4.</w:t>
+        <w:t>Al final del notebook hay una síntesis para completar — guárdenla, la van a poder contrastar con los resultados reales del Bloque 6.</w:t>
       </w:r>
     </w:p>
     <w:p>
@@ -1537,8 +1813,7 @@
         <w:rPr/>
       </w:pPr>
       <w:r>
-        <w:rPr/>
-        <w:t>Bloques 2 y 3 — Clasificación en Orange</w:t>
+        <w:t>Bloques 2, 3 y 4 — Clasificación en Orange</w:t>
       </w:r>
     </w:p>
     <w:p>
@@ -1547,8 +1822,7 @@
         <w:rPr/>
       </w:pPr>
       <w:r>
-        <w:rPr/>
-        <w:t>Ambos workflows (bag_of_aminoacidos.ows y dipeptidos.ows) ya vienen armados con la misma estructura:</w:t>
+        <w:t>Los tres workflows (bag_of_aminoacidos.ows, dipeptidos.ows y senales_posicionales.ows) ya vienen armados con la misma estructura:</w:t>
       </w:r>
     </w:p>
     <w:p>
@@ -1557,8 +1831,7 @@
         <w:rPr/>
       </w:pPr>
       <w:r>
-        <w:rPr/>
-        <w:t>File → Logistic Regression / Random Forest / SVM → Test and Score → Confusion Matrix</w:t>
+        <w:t>File → Logistic Regression / Random Forest / SVM → Test and Score → Confusion Matrix (el de señales agrega además el widget Rank)</w:t>
       </w:r>
     </w:p>
     <w:p>
@@ -1623,8 +1896,16 @@
         <w:rPr/>
       </w:pPr>
       <w:r>
-        <w:rPr/>
-        <w:t>Repitan el mismo procedimiento en el Bloque 3 con el otro workflow, y anoten los resultados para poder compararlos en el Bloque 4.</w:t>
+        <w:t>Repitan el mismo procedimiento en el Bloque 3 con el otro workflow, y anoten los resultados para poder compararlos en el Bloque 6.</w:t>
+      </w:r>
+    </w:p>
+    <w:p>
+      <w:pPr>
+        <w:pStyle w:val="Normal"/>
+        <w:rPr/>
+      </w:pPr>
+      <w:r>
+        <w:t>En el Bloque 4 (señales posicionales) sigan el mismo procedimiento con senales_posicionales.ows. Además del Test and Score, abran el widget Rank para ver qué features pesan más: esperable que tmd_alfa_* y senal_hidrofobicidad_max queden arriba.</w:t>
       </w:r>
     </w:p>
     <w:p>
@@ -1633,8 +1914,7 @@
         <w:rPr/>
       </w:pPr>
       <w:r>
-        <w:rPr/>
-        <w:t>Bloque 4 — Comparación final y discusión</w:t>
+        <w:t>Bloque 6 — Comparación final y discusión</w:t>
       </w:r>
     </w:p>
     <w:p>
@@ -1643,8 +1923,7 @@
         <w:rPr/>
       </w:pPr>
       <w:r>
-        <w:rPr/>
-        <w:t>Armen una tabla comparando ambas representaciones:</w:t>
+        <w:t>Armen una tabla comparando las tres representaciones:</w:t>
       </w:r>
     </w:p>
     <w:tbl>
@@ -1805,16 +2084,8 @@
             </w:tcBorders>
           </w:tcPr>
           <w:p>
-            <w:pPr>
-              <w:pStyle w:val="Normal"/>
-              <w:rPr/>
-            </w:pPr>
-            <w:r>
-              <w:rPr>
-                <w:b w:val="false"/>
-                <w:bCs w:val="false"/>
-              </w:rPr>
-              <w:t>30</w:t>
+            <w:r>
+              <w:t>33</w:t>
             </w:r>
           </w:p>
         </w:tc>
@@ -1896,22 +2167,34 @@
             </w:tcBorders>
           </w:tcPr>
           <w:p>
+            <w:r>
+              <w:t>413</w:t>
+            </w:r>
+          </w:p>
+        </w:tc>
+        <w:tc>
+          <w:tcPr>
+            <w:tcW w:w="2000" w:type="dxa"/>
+            <w:tcBorders>
+              <w:top w:val="single" w:sz="4" w:space="0" w:color="000000"/>
+              <w:left w:val="single" w:sz="4" w:space="0" w:color="000000"/>
+              <w:bottom w:val="single" w:sz="4" w:space="0" w:color="000000"/>
+              <w:right w:val="single" w:sz="4" w:space="0" w:color="000000"/>
+            </w:tcBorders>
+          </w:tcPr>
+          <w:p>
             <w:pPr>
               <w:pStyle w:val="Normal"/>
               <w:rPr/>
             </w:pPr>
             <w:r>
-              <w:rPr>
-                <w:b w:val="false"/>
-                <w:bCs w:val="false"/>
-              </w:rPr>
-              <w:t>410</w:t>
-            </w:r>
-          </w:p>
-        </w:tc>
-        <w:tc>
-          <w:tcPr>
-            <w:tcW w:w="2000" w:type="dxa"/>
+              <w:rPr/>
+            </w:r>
+          </w:p>
+        </w:tc>
+        <w:tc>
+          <w:tcPr>
+            <w:tcW w:w="1999" w:type="dxa"/>
             <w:tcBorders>
               <w:top w:val="single" w:sz="4" w:space="0" w:color="000000"/>
               <w:left w:val="single" w:sz="4" w:space="0" w:color="000000"/>
@@ -1929,24 +2212,42 @@
             </w:r>
           </w:p>
         </w:tc>
-        <w:tc>
-          <w:tcPr>
-            <w:tcW w:w="1999" w:type="dxa"/>
-            <w:tcBorders>
-              <w:top w:val="single" w:sz="4" w:space="0" w:color="000000"/>
-              <w:left w:val="single" w:sz="4" w:space="0" w:color="000000"/>
-              <w:bottom w:val="single" w:sz="4" w:space="0" w:color="000000"/>
-              <w:right w:val="single" w:sz="4" w:space="0" w:color="000000"/>
-            </w:tcBorders>
-          </w:tcPr>
-          <w:p>
-            <w:pPr>
-              <w:pStyle w:val="Normal"/>
-              <w:rPr/>
-            </w:pPr>
-            <w:r>
-              <w:rPr/>
-            </w:r>
+      </w:tr>
+      <w:tr>
+        <w:tc>
+          <w:tcPr>
+            <w:tcW w:type="dxa" w:w="3350"/>
+          </w:tcPr>
+          <w:p>
+            <w:r>
+              <w:t>Composición + fisicoquímicos + señales</w:t>
+            </w:r>
+          </w:p>
+        </w:tc>
+        <w:tc>
+          <w:tcPr>
+            <w:tcW w:type="dxa" w:w="2000"/>
+          </w:tcPr>
+          <w:p>
+            <w:r>
+              <w:t>44</w:t>
+            </w:r>
+          </w:p>
+        </w:tc>
+        <w:tc>
+          <w:tcPr>
+            <w:tcW w:type="dxa" w:w="2000"/>
+          </w:tcPr>
+          <w:p>
+            <w:r/>
+          </w:p>
+        </w:tc>
+        <w:tc>
+          <w:tcPr>
+            <w:tcW w:type="dxa" w:w="1999"/>
+          </w:tcPr>
+          <w:p>
+            <w:r/>
           </w:p>
         </w:tc>
       </w:tr>
@@ -1966,25 +2267,7 @@
         <w:rPr/>
       </w:pPr>
       <w:r>
-        <w:rPr>
-          <w:b/>
-          <w:bCs/>
-        </w:rPr>
-        <w:t xml:space="preserve">Preguntas </w:t>
-      </w:r>
-      <w:r>
-        <w:rPr>
-          <w:b/>
-          <w:bCs/>
-        </w:rPr>
-        <w:t>para refelxionar</w:t>
-      </w:r>
-      <w:r>
-        <w:rPr>
-          <w:b/>
-          <w:bCs/>
-        </w:rPr>
-        <w:t>:</w:t>
+        <w:t>Preguntas para reflexionar:</w:t>
       </w:r>
     </w:p>
     <w:p>
@@ -2073,12 +2356,15 @@
     </w:p>
     <w:p>
       <w:pPr>
-        <w:pStyle w:val="Heading1"/>
-        <w:spacing w:before="240" w:after="120"/>
-        <w:rPr/>
-      </w:pPr>
-      <w:r>
-        <w:rPr/>
+        <w:pStyle w:val="ListParagraph"/>
+        <w:numPr>
+          <w:ilvl w:val="0"/>
+          <w:numId w:val="4"/>
+        </w:numPr>
+        <w:rPr/>
+      </w:pPr>
+      <w:r>
+        <w:t>La representación con señales incorpora motivos biológicos en posiciones concretas (péptido señal, NLS, TMD). ¿Mejoró respecto a la composición simple? ¿Por qué este tipo de información sí ayuda y los dipéptidos no?</w:t>
       </w:r>
     </w:p>
     <w:sectPr>

</xml_diff>

<commit_message>
actualizo los notebooks y workflow orange con los cambios de RF
</commit_message>
<xml_diff>
--- a/docs/guia_alumnos.docx
+++ b/docs/guia_alumnos.docx
@@ -1645,7 +1645,7 @@
           </w:tcPr>
           <w:p>
             <w:r>
-              <w:t>Script/informe</w:t>
+              <w:t>Notebook/script</w:t>
             </w:r>
           </w:p>
         </w:tc>
@@ -1661,7 +1661,7 @@
           </w:tcPr>
           <w:p>
             <w:r>
-              <w:t>Ver F1 en train vs test y por qué más features no siempre ayudan.</w:t>
+              <w:t>Sección 7 del notebook: comparar un Random Forest sin límites con uno regularizado. Números completos en data/03_experimentos.py.</w:t>
             </w:r>
           </w:p>
         </w:tc>
@@ -1804,7 +1804,7 @@
         <w:rPr/>
       </w:pPr>
       <w:r>
-        <w:t>Al final del notebook hay una síntesis para completar — guárdenla, la van a poder contrastar con los resultados reales del Bloque 6.</w:t>
+        <w:t>La última sección del notebook (nº 7, del Bloque 5) no es un gráfico exploratorio: compara un Random Forest sin límites con uno regularizado para ver el overfitting. Al final del notebook hay una síntesis para completar — guárdenla, la van a poder contrastar con los resultados reales del Bloque 6.</w:t>
       </w:r>
     </w:p>
     <w:p>

</xml_diff>